<commit_message>
docs: cap all HTML files under 200 lines, sync screenshots, report, and cheatsheet
</commit_message>
<xml_diff>
--- a/QUICK_DEFENSE_CHEATSHEET.docx
+++ b/QUICK_DEFENSE_CHEATSHEET.docx
@@ -64,7 +64,7 @@
                 <w:color w:val="0F172A"/>
                 <w:sz w:val="22"/>
               </w:rPr>
-              <w:t>1. Master Frame Architecture (index.html)</w:t>
+              <w:t>1. 100% Alignment with Lecture PPTs (Weeks 1 to 6)</w:t>
               <w:br/>
             </w:r>
             <w:r>
@@ -73,7 +73,7 @@
                 <w:color w:val="EA580C"/>
                 <w:sz w:val="19"/>
               </w:rPr>
-              <w:t>If Asked: "How does this website work?"</w:t>
+              <w:t>If Asked: "Is your code strictly based on what was taught in the lecture slides?"</w:t>
               <w:br/>
             </w:r>
             <w:r>
@@ -82,14 +82,14 @@
                 <w:color w:val="16A34A"/>
                 <w:sz w:val="19"/>
               </w:rPr>
-              <w:t xml:space="preserve">Your 10-Second Answer: </w:t>
+              <w:t xml:space="preserve">Your Answer: </w:t>
             </w:r>
             <w:r>
               <w:rPr>
                 <w:color w:val="334155"/>
                 <w:sz w:val="19"/>
               </w:rPr>
-              <w:t>"This website uses a Master Frame architecture. The navbar is written once in index.html, and content loads inside the &lt;iframe name="mainFrame"&gt; using target="mainFrame" without refreshing the outer navbar."</w:t>
+              <w:t>"Yes. 100% of our code follows the course PPTs: PPT 01 (semantic HTML &amp; lists), PPT 02 (media &amp; tables), PPT 03 (frames &amp; 7-control form), PPT 04 (3 CSS methods &amp; selectors), PPT 05 (4 CSS property categories), and PPT 06 (RWD box-sizing &amp; media queries). No external libraries or complex frameworks were used."</w:t>
             </w:r>
           </w:p>
         </w:tc>
@@ -137,7 +137,7 @@
                 <w:color w:val="0F172A"/>
                 <w:sz w:val="22"/>
               </w:rPr>
-              <w:t>2. The 5 Interconnected Pages</w:t>
+              <w:t>2. Master Frame Architecture (index.html)</w:t>
               <w:br/>
             </w:r>
             <w:r>
@@ -146,7 +146,7 @@
                 <w:color w:val="EA580C"/>
                 <w:sz w:val="19"/>
               </w:rPr>
-              <w:t>If Asked: "What are the 5 pages and what do they contain?"</w:t>
+              <w:t>If Asked: "How does the website and frame navigation work?"</w:t>
               <w:br/>
             </w:r>
             <w:r>
@@ -155,14 +155,14 @@
                 <w:color w:val="16A34A"/>
                 <w:sz w:val="19"/>
               </w:rPr>
-              <w:t xml:space="preserve">Your 10-Second Answer: </w:t>
+              <w:t xml:space="preserve">Your Answer: </w:t>
             </w:r>
             <w:r>
               <w:rPr>
                 <w:color w:val="334155"/>
                 <w:sz w:val="19"/>
               </w:rPr>
-              <w:t>"We have 5 interconnected pages: home.html (lore &amp; enlistment protocol), characters.html (hero cards &amp; stat meters), elements.html (7 elements &amp; matrix table), series.html (canon timeline &amp; watch order), and contact.html (cadet form &amp; student info)."</w:t>
+              <w:t>"We implemented the Master Frame architecture taught in PPT 03. The navigation is placed once in index.html, and page content loads inside &lt;iframe name="mainFrame"&gt; using target="mainFrame" without reloading the outer header."</w:t>
             </w:r>
           </w:p>
         </w:tc>
@@ -210,7 +210,7 @@
                 <w:color w:val="0F172A"/>
                 <w:sz w:val="22"/>
               </w:rPr>
-              <w:t>3. Three Methods of Using CSS</w:t>
+              <w:t>3. The 5 Interconnected Pages (All Under 200 Lines)</w:t>
               <w:br/>
             </w:r>
             <w:r>
@@ -219,7 +219,7 @@
                 <w:color w:val="EA580C"/>
                 <w:sz w:val="19"/>
               </w:rPr>
-              <w:t>If Asked: "Where are the 3 CSS methods implemented?"</w:t>
+              <w:t>If Asked: "What are the 5 pages and why is the code kept compact?"</w:t>
               <w:br/>
             </w:r>
             <w:r>
@@ -228,14 +228,14 @@
                 <w:color w:val="16A34A"/>
                 <w:sz w:val="19"/>
               </w:rPr>
-              <w:t xml:space="preserve">Your 10-Second Answer: </w:t>
+              <w:t xml:space="preserve">Your Answer: </w:t>
             </w:r>
             <w:r>
               <w:rPr>
                 <w:color w:val="334155"/>
                 <w:sz w:val="19"/>
               </w:rPr>
-              <w:t>"1. External CSS in css/style.css for global styles, 2. Internal CSS in &lt;style&gt; tags in &lt;head&gt; for page components, and 3. Inline CSS in style="..." attributes for micro-spacing and specific widths."</w:t>
+              <w:t>"All 5 pages are kept concise under 200 lines each for clear explanation: home.html (179 lines), characters.html (190 lines), elements.html (193 lines), series.html (160 lines), and contact.html (196 lines)."</w:t>
             </w:r>
           </w:p>
         </w:tc>
@@ -283,7 +283,7 @@
                 <w:color w:val="0F172A"/>
                 <w:sz w:val="22"/>
               </w:rPr>
-              <w:t>4. Four Required CSS Property Categories</w:t>
+              <w:t>4. Three Methods of Using CSS (PPT 04)</w:t>
               <w:br/>
             </w:r>
             <w:r>
@@ -292,7 +292,7 @@
                 <w:color w:val="EA580C"/>
                 <w:sz w:val="19"/>
               </w:rPr>
-              <w:t>If Asked: "Name the 4 required CSS property categories!"</w:t>
+              <w:t>If Asked: "Where are the 3 CSS methods implemented?"</w:t>
               <w:br/>
             </w:r>
             <w:r>
@@ -301,14 +301,14 @@
                 <w:color w:val="16A34A"/>
                 <w:sz w:val="19"/>
               </w:rPr>
-              <w:t xml:space="preserve">Your 10-Second Answer: </w:t>
+              <w:t xml:space="preserve">Your Answer: </w:t>
             </w:r>
             <w:r>
               <w:rPr>
                 <w:color w:val="334155"/>
                 <w:sz w:val="19"/>
               </w:rPr>
-              <w:t>"1. Background (color, image, position, repeat, size), 2. Text/Font (family, size, weight, line-height, color), 3. Dimensions (width, min-width, max-width, height, min-height), and 4. Positioning (position, top, bottom, left, right, z-index)."</w:t>
+              <w:t>"1. External CSS in css/style.css for global design, 2. Internal CSS in &lt;style&gt; tags in &lt;head&gt; for page demos, and 3. Inline CSS in style="..." attributes for specific widths and micro-adjustments."</w:t>
             </w:r>
           </w:p>
         </w:tc>
@@ -356,7 +356,7 @@
                 <w:color w:val="0F172A"/>
                 <w:sz w:val="22"/>
               </w:rPr>
-              <w:t>5. Form &amp; Semantic HTML5 Validation (contact.html)</w:t>
+              <w:t>5. Four Required CSS Property Categories (PPT 05)</w:t>
               <w:br/>
             </w:r>
             <w:r>
@@ -365,7 +365,7 @@
                 <w:color w:val="EA580C"/>
                 <w:sz w:val="19"/>
               </w:rPr>
-              <w:t>If Asked: "What form did you create and how is it validated?"</w:t>
+              <w:t>If Asked: "Name the 4 required CSS property categories with examples!"</w:t>
               <w:br/>
             </w:r>
             <w:r>
@@ -374,14 +374,14 @@
                 <w:color w:val="16A34A"/>
                 <w:sz w:val="19"/>
               </w:rPr>
-              <w:t xml:space="preserve">Your 10-Second Answer: </w:t>
+              <w:t xml:space="preserve">Your Answer: </w:t>
             </w:r>
             <w:r>
               <w:rPr>
                 <w:color w:val="334155"/>
                 <w:sz w:val="19"/>
               </w:rPr>
-              <w:t>"The Cadet Enlistment Form has all 7 required controls (text, password, textarea, radio, checkbox, select, submit). Validation is handled purely with HTML5 attributes like required and minlength="6" with zero JavaScript."</w:t>
+              <w:t>"1. Background (color, image, position, repeat, size, attachment), 2. Text/Font (family, size, weight, line-height, text-align), 3. Dimensions (width, min-width, max-width, height, min-height), and 4. Positioning (position, top, bottom, left, right, z-index)."</w:t>
             </w:r>
           </w:p>
         </w:tc>
@@ -429,7 +429,7 @@
                 <w:color w:val="0F172A"/>
                 <w:sz w:val="22"/>
               </w:rPr>
-              <w:t>6. Clean Card Design &amp; Light Ambient Shadow</w:t>
+              <w:t>6. Cadet Form &amp; Semantic HTML5 Validation (PPT 03)</w:t>
               <w:br/>
             </w:r>
             <w:r>
@@ -438,7 +438,7 @@
                 <w:color w:val="EA580C"/>
                 <w:sz w:val="19"/>
               </w:rPr>
-              <w:t>If Asked: "Why does the design look clean and human-crafted rather than heavy AI?"</w:t>
+              <w:t>If Asked: "What controls are in the form and how are they validated?"</w:t>
               <w:br/>
             </w:r>
             <w:r>
@@ -447,14 +447,87 @@
                 <w:color w:val="16A34A"/>
                 <w:sz w:val="19"/>
               </w:rPr>
-              <w:t xml:space="preserve">Your 10-Second Answer: </w:t>
+              <w:t xml:space="preserve">Your Answer: </w:t>
             </w:r>
             <w:r>
               <w:rPr>
                 <w:color w:val="334155"/>
                 <w:sz w:val="19"/>
               </w:rPr>
-              <w:t>"We used standard CSS Box Model spacing with a soft ambient shadow (box-shadow: 0 2px 4px rgba(0,0,0,0.06)) and crisp 1px borders, avoiding heavy artificial neon glow effects."</w:t>
+              <w:t>"The Cadet Form in contact.html includes all 7 required controls: Text, Password, Textarea, Radio, Checkbox, Select dropdown, and Submit button. Validation is handled with native HTML5 attributes (required, placeholder, minlength) without JavaScript."</w:t>
+            </w:r>
+          </w:p>
+        </w:tc>
+      </w:tr>
+    </w:tbl>
+    <w:p>
+      <w:pPr>
+        <w:spacing w:before="0" w:after="80"/>
+      </w:pPr>
+    </w:p>
+    <w:tbl>
+      <w:tblPr>
+        <w:tblW w:type="auto" w:w="0"/>
+        <w:tblLayout w:type="fixed"/>
+        <w:tblLook w:firstColumn="1" w:firstRow="1" w:lastColumn="0" w:lastRow="0" w:noHBand="0" w:noVBand="1" w:val="04A0"/>
+      </w:tblPr>
+      <w:tblGrid>
+        <w:gridCol w:w="9936"/>
+      </w:tblGrid>
+      <w:tr>
+        <w:tc>
+          <w:tcPr>
+            <w:tcW w:type="dxa" w:w="9360"/>
+            <w:shd w:fill="F8FAFC"/>
+            <w:tcMar>
+              <w:top w:w="120" w:type="dxa"/>
+              <w:bottom w:w="120" w:type="dxa"/>
+              <w:left w:w="160" w:type="dxa"/>
+              <w:right w:w="160" w:type="dxa"/>
+            </w:tcMar>
+            <w:tcBorders>
+              <w:top w:val="none"/>
+              <w:left w:val="single" w:sz="30" w:space="0" w:color="EA580C"/>
+              <w:bottom w:val="none"/>
+              <w:right w:val="none"/>
+            </w:tcBorders>
+          </w:tcPr>
+          <w:p>
+            <w:pPr>
+              <w:spacing w:before="0" w:after="40"/>
+            </w:pPr>
+            <w:r>
+              <w:rPr>
+                <w:b/>
+                <w:color w:val="0F172A"/>
+                <w:sz w:val="22"/>
+              </w:rPr>
+              <w:t>7. Clean Box Model &amp; Responsive Design (PPT 06)</w:t>
+              <w:br/>
+            </w:r>
+            <w:r>
+              <w:rPr>
+                <w:i/>
+                <w:color w:val="EA580C"/>
+                <w:sz w:val="19"/>
+              </w:rPr>
+              <w:t>If Asked: "How is responsive design implemented?"</w:t>
+              <w:br/>
+            </w:r>
+            <w:r>
+              <w:rPr>
+                <w:b/>
+                <w:color w:val="16A34A"/>
+                <w:sz w:val="19"/>
+              </w:rPr>
+              <w:t xml:space="preserve">Your Answer: </w:t>
+            </w:r>
+            <w:r>
+              <w:rPr>
+                <w:color w:val="334155"/>
+                <w:sz w:val="19"/>
+              </w:rPr>
+              <w:t>"We used standard CSS Box Model with universal * { box-sizing: border-box; }, viewport meta tag, and clean CSS Media Queries (@media (max-width: 768px)) as instructed in PPT 06."</w:t>
             </w:r>
           </w:p>
         </w:tc>

</xml_diff>